<commit_message>
Add initial project structure and scripts for metabolomics assignment
- Created R project file for assignment.
- Added design document in both .docx and .txt formats.
- Introduced environment variables for utility file paths and data directory.
- Implemented data preparation and quality control script with PCA analysis.
- Developed utility functions for data loading, missing value handling, and PCA.
- Added a new script for data pretreatment methods.
- Included initial R plots output file.
</commit_message>
<xml_diff>
--- a/assignment/docs/design_document.docx
+++ b/assignment/docs/design_document.docx
@@ -181,13 +181,7 @@
         </w:numPr>
       </w:pPr>
       <w:r>
-        <w:t xml:space="preserve">Use PCA and other suitable </w:t>
-      </w:r>
-      <w:r>
-        <w:t>visualization</w:t>
-      </w:r>
-      <w:r>
-        <w:t xml:space="preserve"> techniques to explore the data and decide if the pre-treatments have any effect.</w:t>
+        <w:t>Use PCA and other suitable visualization techniques to explore the data and decide if the pre-treatments have any effect.</w:t>
       </w:r>
     </w:p>
     <w:p>
@@ -429,13 +423,7 @@
         </w:numPr>
       </w:pPr>
       <w:r>
-        <w:t xml:space="preserve">You will use the data from Year1 to train and </w:t>
-      </w:r>
-      <w:r>
-        <w:t>optimize</w:t>
-      </w:r>
-      <w:r>
-        <w:t xml:space="preserve"> the classification model and the data from Year2 to validate its performance</w:t>
+        <w:t>You will use the data from Year1 to train and optimize the classification model and the data from Year2 to validate its performance</w:t>
       </w:r>
     </w:p>
     <w:p>
@@ -575,13 +563,7 @@
         </w:numPr>
       </w:pPr>
       <w:r>
-        <w:t xml:space="preserve">repeat the process above, but this time use Year2 to train and </w:t>
-      </w:r>
-      <w:r>
-        <w:t>optimize</w:t>
-      </w:r>
-      <w:r>
-        <w:t xml:space="preserve"> the model and Year1 as test set.</w:t>
+        <w:t>repeat the process above, but this time use Year2 to train and optimize the model and Year1 as test set.</w:t>
       </w:r>
     </w:p>
     <w:p>
@@ -746,13 +728,7 @@
         </w:numPr>
       </w:pPr>
       <w:r>
-        <w:t xml:space="preserve">Random Forest with feature extraction with RCatch22 package to </w:t>
-      </w:r>
-      <w:r>
-        <w:t>transform</w:t>
-      </w:r>
-      <w:r>
-        <w:t xml:space="preserve"> the features (variables) into 22</w:t>
+        <w:t>Random Forest with feature extraction with RCatch22 package to transform the features (variables) into 22</w:t>
       </w:r>
       <w:r>
         <w:t xml:space="preserve"> </w:t>
@@ -2427,6 +2403,7 @@
   <w:style w:type="character" w:default="1" w:styleId="DefaultParagraphFont">
     <w:name w:val="Default Paragraph Font"/>
     <w:uiPriority w:val="1"/>
+    <w:semiHidden/>
     <w:unhideWhenUsed/>
   </w:style>
   <w:style w:type="table" w:default="1" w:styleId="TableNormal">

</xml_diff>